<commit_message>
Readme + UI upgrades
</commit_message>
<xml_diff>
--- a/templates/purchase-order-template.docx
+++ b/templates/purchase-order-template.docx
@@ -20,7 +20,7 @@
         <w:t xml:space="preserve">Client : </w:t>
       </w:r>
       <w:r>
-        <w:t>+++INS nomClient != null ? nomClient : ''+++</w:t>
+        <w:t>+++INS nomClientAffiche+++</w:t>
       </w:r>
     </w:p>
     <w:p>
@@ -28,7 +28,7 @@
         <w:t xml:space="preserve">Référence devis : </w:t>
       </w:r>
       <w:r>
-        <w:t>+++INS numeroDevis != null ? numeroDevis : ''+++</w:t>
+        <w:t>+++INS numeroDevisAffiche+++</w:t>
       </w:r>
     </w:p>
     <w:p>
@@ -36,7 +36,7 @@
         <w:t xml:space="preserve">Date du devis : </w:t>
       </w:r>
       <w:r>
-        <w:t>+++INS dateDevis != null ? dateDevis : ''+++</w:t>
+        <w:t>+++INS dateDevisAffiche+++</w:t>
       </w:r>
     </w:p>
     <w:p>
@@ -44,7 +44,7 @@
         <w:t xml:space="preserve">Validité : </w:t>
       </w:r>
       <w:r>
-        <w:t>+++INS validiteDevis != null ? validiteDevis : ''+++</w:t>
+        <w:t>+++INS validiteDevisAffiche+++</w:t>
       </w:r>
     </w:p>
     <w:p>
@@ -57,13 +57,7 @@
     </w:p>
     <w:p>
       <w:r>
-        <w:t xml:space="preserve">TVA </w:t>
-      </w:r>
-      <w:r>
-        <w:t>+++INS tauxTvaFormate != '' ? tauxTvaFormate + ' %' : ''+++</w:t>
-      </w:r>
-      <w:r>
-        <w:t xml:space="preserve"> : </w:t>
+        <w:t xml:space="preserve">+++INS tvaLibelle+++ : </w:t>
       </w:r>
       <w:r>
         <w:t>+++INS montantTvaFormate+++</w:t>
@@ -79,12 +73,12 @@
     </w:p>
     <w:p>
       <w:r>
-        <w:t>Resume :</w:t>
+        <w:t>Résumé :</w:t>
       </w:r>
     </w:p>
     <w:p>
       <w:r>
-        <w:t>+++INS resume != null ? resume : ''+++</w:t>
+        <w:t>+++INS resumeAffiche+++</w:t>
       </w:r>
     </w:p>
     <w:p>
@@ -94,7 +88,7 @@
     </w:p>
     <w:p>
       <w:r>
-        <w:t>+++INS paymentTerms != null ? paymentTerms : ''+++</w:t>
+        <w:t>+++INS paymentTermsAffiche+++</w:t>
       </w:r>
     </w:p>
     <w:p>
@@ -104,7 +98,7 @@
     </w:p>
     <w:p>
       <w:r>
-        <w:t>+++INS regulatoryNotes != null ? regulatoryNotes : ''+++</w:t>
+        <w:t>+++INS regulatoryNotesAffiche+++</w:t>
       </w:r>
     </w:p>
     <w:p>
@@ -114,7 +108,7 @@
     </w:p>
     <w:p>
       <w:r>
-        <w:t>+++INS warranty != null ? warranty : ''+++</w:t>
+        <w:t>+++INS warrantyAffiche+++</w:t>
       </w:r>
     </w:p>
     <w:p>
@@ -132,13 +126,13 @@
         <w:t xml:space="preserve">- </w:t>
       </w:r>
       <w:r>
-        <w:t>+++INS $ligne.description+++</w:t>
+        <w:t>+++INS $ligne.descriptionAffiche+++</w:t>
       </w:r>
       <w:r>
         <w:t xml:space="preserve"> | Quantité : </w:t>
       </w:r>
       <w:r>
-        <w:t>+++INS $ligne.quantite != null ? $ligne.quantite : ''+++</w:t>
+        <w:t>+++INS $ligne.quantiteAffiche+++</w:t>
       </w:r>
       <w:r>
         <w:t xml:space="preserve"> | Prix unitaire HT : </w:t>

</xml_diff>